<commit_message>
random() works i think???
</commit_message>
<xml_diff>
--- a/remnant_chronicles_site_plan.docx
+++ b/remnant_chronicles_site_plan.docx
@@ -152,6 +152,32 @@
       </w:r>
       <w:r>
         <w:t xml:space="preserve">. If there is interest in reading Remnant chronicles, then they can get more information. </w:t>
+      </w:r>
+    </w:p>
+    <w:p>
+      <w:pPr>
+        <w:pStyle w:val="NormalWeb"/>
+        <w:jc w:val="center"/>
+        <w:rPr>
+          <w:b/>
+          <w:bCs/>
+        </w:rPr>
+      </w:pPr>
+      <w:r>
+        <w:rPr>
+          <w:b/>
+          <w:bCs/>
+        </w:rPr>
+        <w:t>Dynamic elements</w:t>
+      </w:r>
+    </w:p>
+    <w:p>
+      <w:pPr>
+        <w:pStyle w:val="NormalWeb"/>
+        <w:jc w:val="center"/>
+      </w:pPr>
+      <w:r>
+        <w:t xml:space="preserve">I will use filter, map, and sort to help generate different quotes. </w:t>
       </w:r>
     </w:p>
     <w:p>
@@ -301,6 +327,7 @@
         <w:rPr>
           <w:rFonts w:eastAsia="Times New Roman"/>
         </w:rPr>
+        <w:lastRenderedPageBreak/>
         <w:t>Style Guide</w:t>
       </w:r>
     </w:p>
@@ -371,7 +398,6 @@
                 <w:b/>
                 <w:bCs/>
               </w:rPr>
-              <w:lastRenderedPageBreak/>
               <w:t>Primary</w:t>
             </w:r>
           </w:p>
@@ -709,19 +735,11 @@
         </w:rPr>
         <w:t xml:space="preserve">Heading Font: </w:t>
       </w:r>
-      <w:proofErr w:type="spellStart"/>
-      <w:r>
-        <w:rPr>
-          <w:rFonts w:eastAsia="Times New Roman"/>
-        </w:rPr>
-        <w:t>Cinzel</w:t>
-      </w:r>
-      <w:proofErr w:type="spellEnd"/>
-      <w:r>
-        <w:rPr>
-          <w:rFonts w:eastAsia="Times New Roman"/>
-        </w:rPr>
-        <w:t xml:space="preserve"> Decorative</w:t>
+      <w:r>
+        <w:rPr>
+          <w:rFonts w:eastAsia="Times New Roman"/>
+        </w:rPr>
+        <w:t>Cinzel Decorative</w:t>
       </w:r>
     </w:p>
     <w:p>
@@ -757,37 +775,12 @@
           <w:lang w:val="fr-FR"/>
         </w:rPr>
       </w:pPr>
-      <w:proofErr w:type="spellStart"/>
       <w:r>
         <w:rPr>
           <w:rFonts w:eastAsia="Times New Roman"/>
           <w:lang w:val="fr-FR"/>
         </w:rPr>
-        <w:t>Paragraph</w:t>
-      </w:r>
-      <w:proofErr w:type="spellEnd"/>
-      <w:r>
-        <w:rPr>
-          <w:rFonts w:eastAsia="Times New Roman"/>
-          <w:lang w:val="fr-FR"/>
-        </w:rPr>
-        <w:t xml:space="preserve"> </w:t>
-      </w:r>
-      <w:proofErr w:type="gramStart"/>
-      <w:r>
-        <w:rPr>
-          <w:rFonts w:eastAsia="Times New Roman"/>
-          <w:lang w:val="fr-FR"/>
-        </w:rPr>
-        <w:t>Font:</w:t>
-      </w:r>
-      <w:proofErr w:type="gramEnd"/>
-      <w:r>
-        <w:rPr>
-          <w:rFonts w:eastAsia="Times New Roman"/>
-          <w:lang w:val="fr-FR"/>
-        </w:rPr>
-        <w:t xml:space="preserve"> </w:t>
+        <w:t xml:space="preserve">Paragraph Font: </w:t>
       </w:r>
       <w:r>
         <w:rPr>
@@ -1086,7 +1079,6 @@
         <w:rPr>
           <w:rFonts w:eastAsia="Times New Roman"/>
         </w:rPr>
-        <w:lastRenderedPageBreak/>
         <w:t>Overview</w:t>
       </w:r>
     </w:p>
@@ -1642,19 +1634,7 @@
               <w:rPr>
                 <w:rFonts w:eastAsia="Times New Roman"/>
               </w:rPr>
-              <w:t xml:space="preserve">“Today was the day a thousand dreams would </w:t>
-            </w:r>
-            <w:r>
-              <w:rPr>
-                <w:rFonts w:eastAsia="Times New Roman"/>
-              </w:rPr>
-              <w:t>die,</w:t>
-            </w:r>
-            <w:r>
-              <w:rPr>
-                <w:rFonts w:eastAsia="Times New Roman"/>
-              </w:rPr>
-              <w:t xml:space="preserve"> and a single dream would be born.”</w:t>
+              <w:t>“Today was the day a thousand dreams would die, and a single dream would be born.”</w:t>
             </w:r>
           </w:p>
         </w:tc>
@@ -1722,6 +1702,7 @@
               <w:rPr>
                 <w:rFonts w:eastAsia="Times New Roman"/>
               </w:rPr>
+              <w:lastRenderedPageBreak/>
               <w:t>The Kiss of Deception</w:t>
             </w:r>
           </w:p>
@@ -1900,7 +1881,6 @@
               <w:rPr>
                 <w:rFonts w:eastAsia="Times New Roman"/>
               </w:rPr>
-              <w:lastRenderedPageBreak/>
               <w:t>The Kiss of Deception</w:t>
             </w:r>
           </w:p>
@@ -2676,21 +2656,7 @@
               <w:rPr>
                 <w:rFonts w:eastAsia="Times New Roman"/>
               </w:rPr>
-              <w:t xml:space="preserve">Your life is shaped by your own </w:t>
-            </w:r>
-            <w:proofErr w:type="gramStart"/>
-            <w:r>
-              <w:rPr>
-                <w:rFonts w:eastAsia="Times New Roman"/>
-              </w:rPr>
-              <w:t>choices—</w:t>
-            </w:r>
-            <w:proofErr w:type="gramEnd"/>
-            <w:r>
-              <w:rPr>
-                <w:rFonts w:eastAsia="Times New Roman"/>
-              </w:rPr>
-              <w:t>not others.</w:t>
+              <w:t>Your life is shaped by your own choices—not others.</w:t>
             </w:r>
           </w:p>
         </w:tc>
@@ -2721,7 +2687,6 @@
           <w:u w:val="single"/>
         </w:rPr>
       </w:pPr>
-      <w:proofErr w:type="gramStart"/>
       <w:r>
         <w:rPr>
           <w:rFonts w:eastAsia="Times New Roman"/>
@@ -2729,51 +2694,21 @@
           <w:bCs/>
           <w:u w:val="single"/>
         </w:rPr>
-        <w:t>Kiss</w:t>
-      </w:r>
-      <w:proofErr w:type="gramEnd"/>
-      <w:r>
-        <w:rPr>
-          <w:rFonts w:eastAsia="Times New Roman"/>
-          <w:b/>
-          <w:bCs/>
+        <w:t>Kiss of deception:</w:t>
+      </w:r>
+    </w:p>
+    <w:p>
+      <w:pPr>
+        <w:rPr>
+          <w:rFonts w:eastAsia="Times New Roman"/>
           <w:u w:val="single"/>
         </w:rPr>
-        <w:t xml:space="preserve"> </w:t>
-      </w:r>
-      <w:proofErr w:type="gramStart"/>
-      <w:r>
-        <w:rPr>
-          <w:rFonts w:eastAsia="Times New Roman"/>
-          <w:b/>
-          <w:bCs/>
+      </w:pPr>
+      <w:r>
+        <w:rPr>
+          <w:rFonts w:eastAsia="Times New Roman"/>
           <w:u w:val="single"/>
         </w:rPr>
-        <w:t>of</w:t>
-      </w:r>
-      <w:proofErr w:type="gramEnd"/>
-      <w:r>
-        <w:rPr>
-          <w:rFonts w:eastAsia="Times New Roman"/>
-          <w:b/>
-          <w:bCs/>
-          <w:u w:val="single"/>
-        </w:rPr>
-        <w:t xml:space="preserve"> deception:</w:t>
-      </w:r>
-    </w:p>
-    <w:p>
-      <w:pPr>
-        <w:rPr>
-          <w:rFonts w:eastAsia="Times New Roman"/>
-          <w:u w:val="single"/>
-        </w:rPr>
-      </w:pPr>
-      <w:r>
-        <w:rPr>
-          <w:rFonts w:eastAsia="Times New Roman"/>
-          <w:u w:val="single"/>
-        </w:rPr>
         <w:t xml:space="preserve">Summary: </w:t>
       </w:r>
     </w:p>
@@ -2787,6 +2722,7 @@
         <w:rPr>
           <w:rFonts w:eastAsia="Times New Roman"/>
         </w:rPr>
+        <w:lastRenderedPageBreak/>
         <w:t>Princess Arabella Celestine Idris Jezelia flees her wedding day to work at an inn. She goes by her alias Lia and falls in love with the prince that she was</w:t>
       </w:r>
       <w:r>
@@ -2856,7 +2792,6 @@
         <w:rPr>
           <w:rFonts w:eastAsia="Times New Roman"/>
         </w:rPr>
-        <w:lastRenderedPageBreak/>
         <w:t>Tradition</w:t>
       </w:r>
     </w:p>
@@ -3100,21 +3035,7 @@
         <w:rPr>
           <w:rFonts w:eastAsia="Times New Roman"/>
         </w:rPr>
-        <w:t xml:space="preserve">After escaping Venda half alive, Rafe tenderly cares for Lia as they journey towards an outpost. Lia soon learns that Rafe has no intention </w:t>
-      </w:r>
-      <w:proofErr w:type="gramStart"/>
-      <w:r>
-        <w:rPr>
-          <w:rFonts w:eastAsia="Times New Roman"/>
-        </w:rPr>
-        <w:t>on</w:t>
-      </w:r>
-      <w:proofErr w:type="gramEnd"/>
-      <w:r>
-        <w:rPr>
-          <w:rFonts w:eastAsia="Times New Roman"/>
-        </w:rPr>
-        <w:t xml:space="preserve"> taking her back to her kingdom. She journey’s back on her own and learns the full truth of the war that is raging in Morrighan. </w:t>
+        <w:t xml:space="preserve">After escaping Venda half alive, Rafe tenderly cares for Lia as they journey towards an outpost. Lia soon learns that Rafe has no intention on taking her back to her kingdom. She journey’s back on her own and learns the full truth of the war that is raging in Morrighan. </w:t>
       </w:r>
     </w:p>
     <w:p>
@@ -3342,6 +3263,7 @@
         <w:rPr>
           <w:rFonts w:eastAsia="Times New Roman"/>
         </w:rPr>
+        <w:lastRenderedPageBreak/>
         <w:t>Personality</w:t>
       </w:r>
       <w:r>
@@ -3396,56 +3318,27 @@
         <w:rPr>
           <w:rFonts w:eastAsia="Times New Roman"/>
         </w:rPr>
-        <w:t xml:space="preserve">Identity: The Crown Prince (and later King) of </w:t>
-      </w:r>
-      <w:proofErr w:type="spellStart"/>
-      <w:r>
-        <w:rPr>
-          <w:rFonts w:eastAsia="Times New Roman"/>
-        </w:rPr>
-        <w:t>Dalbreck</w:t>
-      </w:r>
-      <w:proofErr w:type="spellEnd"/>
-      <w:r>
-        <w:rPr>
-          <w:rFonts w:eastAsia="Times New Roman"/>
-        </w:rPr>
-        <w:t xml:space="preserve">. </w:t>
-      </w:r>
-    </w:p>
-    <w:p>
-      <w:pPr>
-        <w:rPr>
-          <w:rFonts w:eastAsia="Times New Roman"/>
-        </w:rPr>
-      </w:pPr>
-    </w:p>
-    <w:p>
-      <w:pPr>
-        <w:rPr>
-          <w:rFonts w:eastAsia="Times New Roman"/>
-        </w:rPr>
-      </w:pPr>
-      <w:r>
-        <w:rPr>
-          <w:rFonts w:eastAsia="Times New Roman"/>
-        </w:rPr>
-        <w:lastRenderedPageBreak/>
-        <w:t xml:space="preserve">Origin: The Royal House of </w:t>
-      </w:r>
-      <w:proofErr w:type="spellStart"/>
-      <w:r>
-        <w:rPr>
-          <w:rFonts w:eastAsia="Times New Roman"/>
-        </w:rPr>
-        <w:t>Dalbreck</w:t>
-      </w:r>
-      <w:proofErr w:type="spellEnd"/>
-      <w:r>
-        <w:rPr>
-          <w:rFonts w:eastAsia="Times New Roman"/>
-        </w:rPr>
-        <w:t>, the wealthiest and most militarily advanced of the three main kingdoms.</w:t>
+        <w:t xml:space="preserve">Identity: The Crown Prince (and later King) of Dalbreck. </w:t>
+      </w:r>
+    </w:p>
+    <w:p>
+      <w:pPr>
+        <w:rPr>
+          <w:rFonts w:eastAsia="Times New Roman"/>
+        </w:rPr>
+      </w:pPr>
+    </w:p>
+    <w:p>
+      <w:pPr>
+        <w:rPr>
+          <w:rFonts w:eastAsia="Times New Roman"/>
+        </w:rPr>
+      </w:pPr>
+      <w:r>
+        <w:rPr>
+          <w:rFonts w:eastAsia="Times New Roman"/>
+        </w:rPr>
+        <w:t>Origin: The Royal House of Dalbreck, the wealthiest and most militarily advanced of the three main kingdoms.</w:t>
       </w:r>
     </w:p>
     <w:p>
@@ -3749,7 +3642,7 @@
           <w:noProof/>
         </w:rPr>
         <w:drawing>
-          <wp:inline distT="0" distB="0" distL="0" distR="0" wp14:anchorId="566F61E2" wp14:editId="285533F4">
+          <wp:inline distT="0" distB="0" distL="0" distR="0" wp14:anchorId="566F61E2" wp14:editId="228552D0">
             <wp:extent cx="2270125" cy="3429000"/>
             <wp:effectExtent l="0" t="0" r="0" b="0"/>
             <wp:docPr id="377740323" name="Picture 6"/>
@@ -3796,7 +3689,7 @@
           <w:noProof/>
         </w:rPr>
         <w:drawing>
-          <wp:inline distT="0" distB="0" distL="0" distR="0" wp14:anchorId="5518E126" wp14:editId="26871C4B">
+          <wp:inline distT="0" distB="0" distL="0" distR="0" wp14:anchorId="5518E126" wp14:editId="79EA09C2">
             <wp:extent cx="2156460" cy="3257310"/>
             <wp:effectExtent l="0" t="0" r="0" b="635"/>
             <wp:docPr id="233606425" name="Picture 8" descr="A person in a dress with a bird on her head&#10;&#10;AI-generated content may be incorrect."/>
@@ -4023,7 +3916,7 @@
           </mc:Choice>
           <mc:Fallback>
             <w:pict>
-              <v:rect w14:anchorId="27C897AA" id="Rectangle 1" o:spid="_x0000_s1026" alt="Kaden | Remnant Chronicles Wiki | Fandom" style="width:24pt;height:24pt;visibility:visible;mso-wrap-style:square;mso-left-percent:-10001;mso-top-percent:-10001;mso-position-horizontal:absolute;mso-position-horizontal-relative:char;mso-position-vertical:absolute;mso-position-vertical-relative:line;mso-left-percent:-10001;mso-top-percent:-10001;v-text-anchor:top" o:gfxdata="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" filled="f" stroked="f">
+              <v:rect w14:anchorId="6C5587D9" id="Rectangle 1" o:spid="_x0000_s1026" alt="Kaden | Remnant Chronicles Wiki | Fandom" style="width:24pt;height:24pt;visibility:visible;mso-wrap-style:square;mso-left-percent:-10001;mso-top-percent:-10001;mso-position-horizontal:absolute;mso-position-horizontal-relative:char;mso-position-vertical:absolute;mso-position-vertical-relative:line;mso-left-percent:-10001;mso-top-percent:-10001;v-text-anchor:top" o:gfxdata="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" filled="f" stroked="f">
                 <o:lock v:ext="edit" aspectratio="t"/>
                 <w10:anchorlock/>
               </v:rect>

</xml_diff>